<commit_message>
261005 Release 1.0.6: agrega tara manual y mejoras de validación
</commit_message>
<xml_diff>
--- a/Documentacion/ponderaHelp.docx
+++ b/Documentacion/ponderaHelp.docx
@@ -1,6 +1,6 @@
 
 <file path=word/document.xml><?xml version="1.0" encoding="utf-8"?>
-<w:document xmlns:wpc="http://schemas.microsoft.com/office/word/2010/wordprocessingCanvas" xmlns:cx="http://schemas.microsoft.com/office/drawing/2014/chartex" xmlns:cx1="http://schemas.microsoft.com/office/drawing/2015/9/8/chartex" xmlns:cx2="http://schemas.microsoft.com/office/drawing/2015/10/21/chartex" xmlns:cx3="http://schemas.microsoft.com/office/drawing/2016/5/9/chartex" xmlns:cx4="http://schemas.microsoft.com/office/drawing/2016/5/10/chartex" xmlns:cx5="http://schemas.microsoft.com/office/drawing/2016/5/11/chartex" xmlns:cx6="http://schemas.microsoft.com/office/drawing/2016/5/12/chartex" xmlns:cx7="http://schemas.microsoft.com/office/drawing/2016/5/13/chartex" xmlns:cx8="http://schemas.microsoft.com/office/drawing/2016/5/14/chartex" xmlns:mc="http://schemas.openxmlformats.org/markup-compatibility/2006" xmlns:m="http://schemas.openxmlformats.org/officeDocument/2006/math" xmlns:aink="http://schemas.microsoft.com/office/drawing/2016/ink" xmlns:am3d="http://schemas.microsoft.com/office/drawing/2017/model3d" xmlns:oel="http://schemas.microsoft.com/office/2019/extlst" xmlns:r="http://schemas.openxmlformats.org/officeDocument/2006/relationships" xmlns:wp14="http://schemas.microsoft.com/office/word/2010/wordprocessingDrawing" xmlns:wp="http://schemas.openxmlformats.org/drawingml/2006/wordprocessingDrawing" xmlns:wpg="http://schemas.microsoft.com/office/word/2010/wordprocessingGroup" xmlns:wpi="http://schemas.microsoft.com/office/word/2010/wordprocessingInk" xmlns:wps="http://schemas.microsoft.com/office/word/2010/wordprocessingShape" xmlns:o="urn:schemas-microsoft-com:office:office" xmlns:v="urn:schemas-microsoft-com:vml" xmlns:w10="urn:schemas-microsoft-com:office:word" xmlns:w="http://schemas.openxmlformats.org/wordprocessingml/2006/main" xmlns:w14="http://schemas.microsoft.com/office/word/2010/wordml" xmlns:w15="http://schemas.microsoft.com/office/word/2012/wordml" xmlns:w16cex="http://schemas.microsoft.com/office/word/2018/wordml/cex" xmlns:w16cid="http://schemas.microsoft.com/office/word/2016/wordml/cid" xmlns:w16="http://schemas.microsoft.com/office/word/2018/wordml" xmlns:w16sdtdh="http://schemas.microsoft.com/office/word/2020/wordml/sdtdatahash" xmlns:w16sdtfl="http://schemas.microsoft.com/office/word/2024/wordml/sdtformatlock" xmlns:w16se="http://schemas.microsoft.com/office/word/2015/wordml/symex" xmlns:w16du="http://schemas.microsoft.com/office/word/2023/wordml/word16du" xmlns:wne="http://schemas.microsoft.com/office/word/2006/wordml" mc:Ignorable="w14 w15 w16se w16cid w16 w16cex w16sdtdh w16sdtfl w16du wp14">
+<w:document xmlns:wpc="http://schemas.microsoft.com/office/word/2010/wordprocessingCanvas" xmlns:cx="http://schemas.microsoft.com/office/drawing/2014/chartex" xmlns:cx1="http://schemas.microsoft.com/office/drawing/2015/9/8/chartex" xmlns:cx2="http://schemas.microsoft.com/office/drawing/2015/10/21/chartex" xmlns:cx3="http://schemas.microsoft.com/office/drawing/2016/5/9/chartex" xmlns:cx4="http://schemas.microsoft.com/office/drawing/2016/5/10/chartex" xmlns:cx5="http://schemas.microsoft.com/office/drawing/2016/5/11/chartex" xmlns:cx6="http://schemas.microsoft.com/office/drawing/2016/5/12/chartex" xmlns:cx7="http://schemas.microsoft.com/office/drawing/2016/5/13/chartex" xmlns:cx8="http://schemas.microsoft.com/office/drawing/2016/5/14/chartex" xmlns:mc="http://schemas.openxmlformats.org/markup-compatibility/2006" xmlns:aink="http://schemas.microsoft.com/office/drawing/2016/ink" xmlns:am3d="http://schemas.microsoft.com/office/drawing/2017/model3d" xmlns:o="urn:schemas-microsoft-com:office:office" xmlns:oel="http://schemas.microsoft.com/office/2019/extlst" xmlns:r="http://schemas.openxmlformats.org/officeDocument/2006/relationships" xmlns:m="http://schemas.openxmlformats.org/officeDocument/2006/math" xmlns:v="urn:schemas-microsoft-com:vml" xmlns:wp14="http://schemas.microsoft.com/office/word/2010/wordprocessingDrawing" xmlns:wp="http://schemas.openxmlformats.org/drawingml/2006/wordprocessingDrawing" xmlns:w10="urn:schemas-microsoft-com:office:word" xmlns:w="http://schemas.openxmlformats.org/wordprocessingml/2006/main" xmlns:w14="http://schemas.microsoft.com/office/word/2010/wordml" xmlns:w15="http://schemas.microsoft.com/office/word/2012/wordml" xmlns:w16cex="http://schemas.microsoft.com/office/word/2018/wordml/cex" xmlns:w16cid="http://schemas.microsoft.com/office/word/2016/wordml/cid" xmlns:w16="http://schemas.microsoft.com/office/word/2018/wordml" xmlns:w16du="http://schemas.microsoft.com/office/word/2023/wordml/word16du" xmlns:w16sdtdh="http://schemas.microsoft.com/office/word/2020/wordml/sdtdatahash" xmlns:w16sdtfl="http://schemas.microsoft.com/office/word/2024/wordml/sdtformatlock" xmlns:w16se="http://schemas.microsoft.com/office/word/2015/wordml/symex" xmlns:wpg="http://schemas.microsoft.com/office/word/2010/wordprocessingGroup" xmlns:wpi="http://schemas.microsoft.com/office/word/2010/wordprocessingInk" xmlns:wne="http://schemas.microsoft.com/office/word/2006/wordml" xmlns:wps="http://schemas.microsoft.com/office/word/2010/wordprocessingShape" mc:Ignorable="w14 w15 w16se w16cid w16 w16cex w16sdtdh w16sdtfl w16du wp14">
   <w:body>
     <w:p>
       <w:pPr>
@@ -63,7 +63,7 @@
         <w:jc w:val="both"/>
       </w:pPr>
       <w:r>
-        <w:t>PONDERA – Manual de usuario</w:t>
+        <w:t>PONDERA - Manual de usuario</w:t>
       </w:r>
     </w:p>
     <w:p>
@@ -94,7 +94,19 @@
         <w:t>versión de prueba</w:t>
       </w:r>
       <w:r>
-        <w:t>, la demo se bloquea 15 días después del primer uso en cada instalación. Si desea una instalación para uso mensual, deberá solicitarla como se explica más adelante.</w:t>
+        <w:t xml:space="preserve">, la demo se bloquea 15 días después del primer uso en cada instalación. Si desea </w:t>
+      </w:r>
+      <w:r>
+        <w:t>continuar utilizando la aplicación</w:t>
+      </w:r>
+      <w:r>
+        <w:t>, deberá solicitar</w:t>
+      </w:r>
+      <w:r>
+        <w:t xml:space="preserve"> una licencia</w:t>
+      </w:r>
+      <w:r>
+        <w:t xml:space="preserve"> como se explica más adelante.</w:t>
       </w:r>
     </w:p>
     <w:p>
@@ -132,26 +144,51 @@
         <w:t xml:space="preserve"> puertos</w:t>
       </w:r>
       <w:r>
-        <w:t xml:space="preserve"> Ethernet/TCP o RS-232.</w:t>
-      </w:r>
-    </w:p>
-    <w:p>
-      <w:pPr>
-        <w:jc w:val="both"/>
-      </w:pPr>
-    </w:p>
-    <w:p>
-      <w:pPr>
-        <w:jc w:val="both"/>
-      </w:pPr>
-      <w:r>
-        <w:t>Una vez que Pondera interpreta la trama enviada por el indicador, la aplicación muestra el peso actual y puede escribir el valor en el campo activo del sistema, usando comandos de teclado configurables, como</w:t>
-      </w:r>
-      <w:r>
-        <w:t xml:space="preserve"> texto,</w:t>
-      </w:r>
-      <w:r>
-        <w:t xml:space="preserve"> TAB, ENTER, SPACE, etc. Es posible también incluir la fecha y hora del sistema.</w:t>
+        <w:t xml:space="preserve"> Ethernet/TCP</w:t>
+      </w:r>
+      <w:r>
+        <w:t>, Wi-Fi/TCP</w:t>
+      </w:r>
+      <w:r>
+        <w:t xml:space="preserve"> o RS-232.</w:t>
+      </w:r>
+    </w:p>
+    <w:p>
+      <w:pPr>
+        <w:jc w:val="both"/>
+      </w:pPr>
+    </w:p>
+    <w:p>
+      <w:r>
+        <w:t xml:space="preserve">Una vez que Pondera interpreta la trama enviada por el indicador, la aplicación muestra el peso actual y </w:t>
+      </w:r>
+      <w:r>
+        <w:t>escribe</w:t>
+      </w:r>
+      <w:r>
+        <w:t xml:space="preserve"> </w:t>
+      </w:r>
+      <w:r>
+        <w:t>su</w:t>
+      </w:r>
+      <w:r>
+        <w:t xml:space="preserve"> valor en el campo activo </w:t>
+      </w:r>
+      <w:r>
+        <w:t>que tenga en ese momento el</w:t>
+      </w:r>
+      <w:r>
+        <w:t xml:space="preserve"> sistema</w:t>
+      </w:r>
+      <w:r>
+        <w:t xml:space="preserve"> de modo que el usuario puede capturar el peso directamente en el campo de cualquier aplicación como Excel, Word, Notepad, su ERP, etc.</w:t>
+      </w:r>
+      <w:r>
+        <w:br/>
+      </w:r>
+      <w:r>
+        <w:br/>
+        <w:t>La captura del peso se puede hacer de tres maneras:</w:t>
       </w:r>
     </w:p>
     <w:p>
@@ -159,12 +196,11 @@
         <w:pStyle w:val="Prrafodelista"/>
         <w:numPr>
           <w:ilvl w:val="0"/>
-          <w:numId w:val="2"/>
+          <w:numId w:val="16"/>
         </w:numPr>
-        <w:jc w:val="both"/>
-      </w:pPr>
-      <w:r>
-        <w:t>Puede trabajar con recetas de lectura basadas en expresiones regulares.</w:t>
+      </w:pPr>
+      <w:r>
+        <w:t>Captura manual desde el botón PRINT del indicador de peso.</w:t>
       </w:r>
     </w:p>
     <w:p>
@@ -172,12 +208,11 @@
         <w:pStyle w:val="Prrafodelista"/>
         <w:numPr>
           <w:ilvl w:val="0"/>
-          <w:numId w:val="2"/>
+          <w:numId w:val="16"/>
         </w:numPr>
-        <w:jc w:val="both"/>
-      </w:pPr>
-      <w:r>
-        <w:t>Puede pedir ayuda a la inteligencia artificial para generar o actualizar la receta a partir de una trama real.</w:t>
+      </w:pPr>
+      <w:r>
+        <w:t>Captura desde el teclado del PC, mediante la tecla F12.</w:t>
       </w:r>
     </w:p>
     <w:p>
@@ -185,18 +220,15 @@
         <w:pStyle w:val="Prrafodelista"/>
         <w:numPr>
           <w:ilvl w:val="0"/>
-          <w:numId w:val="2"/>
+          <w:numId w:val="16"/>
         </w:numPr>
-        <w:jc w:val="both"/>
-      </w:pPr>
-      <w:r>
-        <w:t>Puede operar con licencia demo o con licencia offline de activación mensual.</w:t>
-      </w:r>
-    </w:p>
-    <w:p>
-      <w:pPr>
-        <w:jc w:val="both"/>
-      </w:pPr>
+      </w:pPr>
+      <w:r>
+        <w:t>Captura automática cuando el indicador estabiliza su peso.</w:t>
+      </w:r>
+      <w:r>
+        <w:br/>
+      </w:r>
     </w:p>
     <w:p>
       <w:pPr>
@@ -216,7 +248,13 @@
         <w:jc w:val="both"/>
       </w:pPr>
       <w:r>
-        <w:t>Al abrir la aplicación por primera vez, revise el estado de licencia y luego configure el enlace con el indicador.</w:t>
+        <w:t>Al abrir la aplicación por primera vez, revise el estado de licencia y luego configure el enlace con el indicador</w:t>
+      </w:r>
+      <w:r>
+        <w:t xml:space="preserve"> como se explica más adelante</w:t>
+      </w:r>
+      <w:r>
+        <w:t>.</w:t>
       </w:r>
     </w:p>
     <w:p>
@@ -242,7 +280,19 @@
         <w:jc w:val="both"/>
       </w:pPr>
       <w:r>
-        <w:t>Para este paso, asegúrese de que la aplicación ha recibido una trama de muestra en el campo “Última trama recibida”</w:t>
+        <w:t>Para este paso, asegúrese de</w:t>
+      </w:r>
+      <w:r>
+        <w:t xml:space="preserve"> tener conexión a Internet y</w:t>
+      </w:r>
+      <w:r>
+        <w:t xml:space="preserve"> que la aplicación ha</w:t>
+      </w:r>
+      <w:r>
+        <w:t>ya</w:t>
+      </w:r>
+      <w:r>
+        <w:t xml:space="preserve"> recibido una trama de muestra en el campo “Última trama recibida”.</w:t>
       </w:r>
     </w:p>
     <w:p>
@@ -324,7 +374,22 @@
         <w:jc w:val="both"/>
       </w:pPr>
       <w:r>
-        <w:t xml:space="preserve">En cuanto el botón “Crear receta sea presionado”, se abrirá un cuadro de diálogo solicitando el valor esperado. Aquí debemos poner el valor tal cual lo queremos recibir. </w:t>
+        <w:t>En cuanto el botón “</w:t>
+      </w:r>
+      <w:r>
+        <w:t>Actualizar</w:t>
+      </w:r>
+      <w:r>
+        <w:t xml:space="preserve"> receta</w:t>
+      </w:r>
+      <w:r>
+        <w:t>”</w:t>
+      </w:r>
+      <w:r>
+        <w:t xml:space="preserve"> sea presionado, se abrirá un cuadro de diálogo solicitando el valor esperado. Aquí debemos poner el valor tal cual lo queremos recibir.</w:t>
+      </w:r>
+      <w:r>
+        <w:t xml:space="preserve"> </w:t>
       </w:r>
     </w:p>
     <w:p>
@@ -359,14 +424,11 @@
         <w:jc w:val="both"/>
       </w:pPr>
       <w:r>
-        <w:rPr>
-          <w:noProof/>
-        </w:rPr>
         <w:drawing>
-          <wp:inline distT="0" distB="0" distL="0" distR="0" wp14:anchorId="423DB15B" wp14:editId="7BBFC9EA">
-            <wp:extent cx="5612130" cy="1267460"/>
-            <wp:effectExtent l="0" t="0" r="1270" b="2540"/>
-            <wp:docPr id="230294847" name="Imagen 1"/>
+          <wp:inline distT="0" distB="0" distL="0" distR="0" wp14:anchorId="10486675" wp14:editId="446E7588">
+            <wp:extent cx="5612130" cy="1253490"/>
+            <wp:effectExtent l="0" t="0" r="7620" b="3810"/>
+            <wp:docPr id="1677394960" name="Imagen 1"/>
             <wp:cNvGraphicFramePr>
               <a:graphicFrameLocks xmlns:a="http://schemas.openxmlformats.org/drawingml/2006/main" noChangeAspect="1"/>
             </wp:cNvGraphicFramePr>
@@ -374,7 +436,7 @@
               <a:graphicData uri="http://schemas.openxmlformats.org/drawingml/2006/picture">
                 <pic:pic xmlns:pic="http://schemas.openxmlformats.org/drawingml/2006/picture">
                   <pic:nvPicPr>
-                    <pic:cNvPr id="230294847" name=""/>
+                    <pic:cNvPr id="1677394960" name=""/>
                     <pic:cNvPicPr/>
                   </pic:nvPicPr>
                   <pic:blipFill>
@@ -386,7 +448,7 @@
                   <pic:spPr>
                     <a:xfrm>
                       <a:off x="0" y="0"/>
-                      <a:ext cx="5612130" cy="1267460"/>
+                      <a:ext cx="5612130" cy="1253490"/>
                     </a:xfrm>
                     <a:prstGeom prst="rect">
                       <a:avLst/>
@@ -398,6 +460,11 @@
           </wp:inline>
         </w:drawing>
       </w:r>
+    </w:p>
+    <w:p>
+      <w:pPr>
+        <w:jc w:val="both"/>
+      </w:pPr>
     </w:p>
     <w:p>
       <w:pPr>
@@ -919,27 +986,24 @@
         <w:rPr>
           <w:lang w:val="es-ES_tradnl"/>
         </w:rPr>
-        <w:t xml:space="preserve"> del archivo recibido desde el panel “Licencia”</w:t>
-      </w:r>
-    </w:p>
-    <w:p>
-      <w:pPr>
-        <w:jc w:val="both"/>
-      </w:pPr>
-    </w:p>
-    <w:p>
-      <w:pPr>
-        <w:jc w:val="both"/>
-      </w:pPr>
-      <w:r>
-        <w:rPr>
-          <w:noProof/>
-        </w:rPr>
+        <w:t xml:space="preserve"> del archivo recibido desde el panel “Licencia”.</w:t>
+      </w:r>
+    </w:p>
+    <w:p>
+      <w:pPr>
+        <w:jc w:val="both"/>
+      </w:pPr>
+    </w:p>
+    <w:p>
+      <w:pPr>
+        <w:jc w:val="both"/>
+      </w:pPr>
+      <w:r>
         <w:drawing>
-          <wp:inline distT="0" distB="0" distL="0" distR="0" wp14:anchorId="5C4DD405" wp14:editId="4B12CDB6">
-            <wp:extent cx="5612130" cy="1301115"/>
-            <wp:effectExtent l="0" t="0" r="1270" b="0"/>
-            <wp:docPr id="2105033768" name="Imagen 1"/>
+          <wp:inline distT="0" distB="0" distL="0" distR="0" wp14:anchorId="63BEECB6" wp14:editId="49232432">
+            <wp:extent cx="5612130" cy="1049020"/>
+            <wp:effectExtent l="0" t="0" r="7620" b="0"/>
+            <wp:docPr id="1075940391" name="Imagen 1"/>
             <wp:cNvGraphicFramePr>
               <a:graphicFrameLocks xmlns:a="http://schemas.openxmlformats.org/drawingml/2006/main" noChangeAspect="1"/>
             </wp:cNvGraphicFramePr>
@@ -947,7 +1011,7 @@
               <a:graphicData uri="http://schemas.openxmlformats.org/drawingml/2006/picture">
                 <pic:pic xmlns:pic="http://schemas.openxmlformats.org/drawingml/2006/picture">
                   <pic:nvPicPr>
-                    <pic:cNvPr id="2105033768" name=""/>
+                    <pic:cNvPr id="1075940391" name=""/>
                     <pic:cNvPicPr/>
                   </pic:nvPicPr>
                   <pic:blipFill>
@@ -959,7 +1023,7 @@
                   <pic:spPr>
                     <a:xfrm>
                       <a:off x="0" y="0"/>
-                      <a:ext cx="5612130" cy="1301115"/>
+                      <a:ext cx="5612130" cy="1049020"/>
                     </a:xfrm>
                     <a:prstGeom prst="rect">
                       <a:avLst/>
@@ -981,9 +1045,13 @@
       <w:pPr>
         <w:pStyle w:val="Ttulo2"/>
         <w:jc w:val="both"/>
-      </w:pPr>
-      <w:r>
-        <w:t>8.Configuración del enlace con el indicador</w:t>
+        <w:numPr>
+          <w:ilvl w:val="0"/>
+          <w:numId w:val="1"/>
+        </w:numPr>
+      </w:pPr>
+      <w:r>
+        <w:t>Configuración del enlace con el indicador</w:t>
       </w:r>
     </w:p>
     <w:p>
@@ -1014,6 +1082,9 @@
       </w:pPr>
       <w:r>
         <w:t>Configuración Ethernet</w:t>
+      </w:r>
+      <w:r>
+        <w:t xml:space="preserve"> y Wi-Fi</w:t>
       </w:r>
     </w:p>
     <w:p>
@@ -1091,8 +1162,7 @@
         <w:pStyle w:val="Ttulo3"/>
       </w:pPr>
       <w:r>
-        <w:lastRenderedPageBreak/>
-        <w:t>Conguración RS-232</w:t>
+        <w:t>Configuración RS-232</w:t>
       </w:r>
     </w:p>
     <w:p>
@@ -1161,7 +1231,13 @@
         <w:t>Problemas de conexión</w:t>
       </w:r>
       <w:r>
-        <w:t>: Si la conexión no se establece porque el PC no reconoce el puerto, es importante instalar el siguiente driver: PROLIFIC 3.3.2.105</w:t>
+        <w:t>: Si la conexión</w:t>
+      </w:r>
+      <w:r>
+        <w:t xml:space="preserve"> RS-232</w:t>
+      </w:r>
+      <w:r>
+        <w:t xml:space="preserve"> no se establece porque el PC no reconoce el puerto, es importante instalar el siguiente driver: PROLIFIC 3.3.2.105</w:t>
       </w:r>
     </w:p>
     <w:p>
@@ -1172,11 +1248,11 @@
     <w:p>
       <w:pPr>
         <w:pStyle w:val="Ttulo2"/>
+        <w:jc w:val="both"/>
         <w:numPr>
           <w:ilvl w:val="0"/>
-          <w:numId w:val="10"/>
+          <w:numId w:val="1"/>
         </w:numPr>
-        <w:jc w:val="both"/>
       </w:pPr>
       <w:r>
         <w:t>Receta de lectura</w:t>
@@ -1259,11 +1335,11 @@
     <w:p>
       <w:pPr>
         <w:pStyle w:val="Ttulo2"/>
+        <w:jc w:val="both"/>
         <w:numPr>
           <w:ilvl w:val="0"/>
-          <w:numId w:val="10"/>
+          <w:numId w:val="1"/>
         </w:numPr>
-        <w:jc w:val="both"/>
       </w:pPr>
       <w:r>
         <w:t>Unidades de medida</w:t>
@@ -1274,7 +1350,7 @@
         <w:jc w:val="both"/>
       </w:pPr>
       <w:r>
-        <w:t>Permitir definir la unidad de entrada que entrega el indicador</w:t>
+        <w:t>Permite definir la unidad de entrada que entrega el indicador</w:t>
       </w:r>
       <w:r>
         <w:t xml:space="preserve"> y la unidad de salida que deseamos mostrar o inyectar, es decir que aunque el indicador nos entregue el peso en kilos, nosotros lo podemos escribir en la unidad que configuremos: gramos, miligramos, onzas, etc.</w:t>
@@ -1320,13 +1396,52 @@
       </w:r>
     </w:p>
     <w:p>
+      <w:r>
+        <w:drawing>
+          <wp:inline distT="0" distB="0" distL="0" distR="0" wp14:anchorId="401BB5F6" wp14:editId="0033CB2F">
+            <wp:extent cx="5612130" cy="728345"/>
+            <wp:effectExtent l="0" t="0" r="7620" b="0"/>
+            <wp:docPr id="436120157" name="Imagen 1"/>
+            <wp:cNvGraphicFramePr>
+              <a:graphicFrameLocks xmlns:a="http://schemas.openxmlformats.org/drawingml/2006/main" noChangeAspect="1"/>
+            </wp:cNvGraphicFramePr>
+            <a:graphic xmlns:a="http://schemas.openxmlformats.org/drawingml/2006/main">
+              <a:graphicData uri="http://schemas.openxmlformats.org/drawingml/2006/picture">
+                <pic:pic xmlns:pic="http://schemas.openxmlformats.org/drawingml/2006/picture">
+                  <pic:nvPicPr>
+                    <pic:cNvPr id="436120157" name=""/>
+                    <pic:cNvPicPr/>
+                  </pic:nvPicPr>
+                  <pic:blipFill>
+                    <a:blip r:embed="rId14"/>
+                    <a:stretch>
+                      <a:fillRect/>
+                    </a:stretch>
+                  </pic:blipFill>
+                  <pic:spPr>
+                    <a:xfrm>
+                      <a:off x="0" y="0"/>
+                      <a:ext cx="5612130" cy="728345"/>
+                    </a:xfrm>
+                    <a:prstGeom prst="rect">
+                      <a:avLst/>
+                    </a:prstGeom>
+                  </pic:spPr>
+                </pic:pic>
+              </a:graphicData>
+            </a:graphic>
+          </wp:inline>
+        </w:drawing>
+      </w:r>
+    </w:p>
+    <w:p>
       <w:pPr>
         <w:pStyle w:val="Ttulo2"/>
+        <w:jc w:val="both"/>
         <w:numPr>
           <w:ilvl w:val="0"/>
-          <w:numId w:val="10"/>
+          <w:numId w:val="1"/>
         </w:numPr>
-        <w:jc w:val="both"/>
       </w:pPr>
       <w:r>
         <w:t>Comandos del teclado</w:t>
@@ -1353,7 +1468,7 @@
         <w:t xml:space="preserve">Los campos de prefijo y sufijo permiten agregar antes o después del </w:t>
       </w:r>
       <w:r>
-        <w:t xml:space="preserve">peso:  </w:t>
+        <w:t xml:space="preserve">peso: </w:t>
       </w:r>
       <w:r>
         <w:t>textos, fecha y hora o comandos como tabulaciones o confirmaciones, por ejemplo, si queremos escribir en una hoja electrónica primero la fecha y hora, luego el número de lote y finalmente el peso y que pase a la línea siguiente, escribiríamos:</w:t>
@@ -1449,7 +1564,13 @@
         <w:jc w:val="both"/>
       </w:pPr>
       <w:r>
-        <w:t>Hará un tab a la celda de la derecha.</w:t>
+        <w:t xml:space="preserve">Hará un tab </w:t>
+      </w:r>
+      <w:r>
+        <w:t>al siguiente campo o celda</w:t>
+      </w:r>
+      <w:r>
+        <w:t>.</w:t>
       </w:r>
     </w:p>
     <w:p>
@@ -1462,7 +1583,7 @@
         <w:jc w:val="both"/>
       </w:pPr>
       <w:r>
-        <w:t>Escribirá el texto “LOTE: 125413.</w:t>
+        <w:t>Escribirá el texto “LOTE: 125413”.</w:t>
       </w:r>
     </w:p>
     <w:p>
@@ -1475,7 +1596,13 @@
         <w:jc w:val="both"/>
       </w:pPr>
       <w:r>
-        <w:t>Hará un nuevo tab a la celda de la derecha.</w:t>
+        <w:t>Hará un nuevo tab a</w:t>
+      </w:r>
+      <w:r>
+        <w:t>l siguiente campo o celda</w:t>
+      </w:r>
+      <w:r>
+        <w:t>.</w:t>
       </w:r>
     </w:p>
     <w:p>
@@ -1488,7 +1615,7 @@
         <w:jc w:val="both"/>
       </w:pPr>
       <w:r>
-        <w:t>Escri birá el peso con el formato y unidades previamente configurados.</w:t>
+        <w:t>Escribirá el peso con el formato y unidades previamente configurados.</w:t>
       </w:r>
     </w:p>
     <w:p>
@@ -1501,7 +1628,7 @@
         <w:jc w:val="both"/>
       </w:pPr>
       <w:r>
-        <w:t>Finalmente hará un ENTER para ir a la fila de abajo y continuar.</w:t>
+        <w:t>Finalmente hará un ENTER.</w:t>
       </w:r>
     </w:p>
     <w:p>
@@ -1550,14 +1677,137 @@
     </w:p>
     <w:p>
       <w:pPr>
+        <w:jc w:val="both"/>
+      </w:pPr>
+    </w:p>
+    <w:p>
+      <w:pPr>
         <w:pStyle w:val="Ttulo2"/>
+        <w:jc w:val="both"/>
         <w:numPr>
           <w:ilvl w:val="0"/>
-          <w:numId w:val="10"/>
+          <w:numId w:val="1"/>
         </w:numPr>
-        <w:jc w:val="both"/>
-      </w:pPr>
-      <w:r>
+      </w:pPr>
+      <w:r>
+        <w:t>Captura y restricción de pesos</w:t>
+      </w:r>
+    </w:p>
+    <w:p>
+      <w:r>
+        <w:t>La aplicación permite establecer tres tipos de capturas de peso:</w:t>
+      </w:r>
+    </w:p>
+    <w:p>
+      <w:pPr>
+        <w:pStyle w:val="Prrafodelista"/>
+        <w:numPr>
+          <w:ilvl w:val="0"/>
+          <w:numId w:val="17"/>
+        </w:numPr>
+      </w:pPr>
+      <w:r>
+        <w:t>Print del indicador.- Cuando queremos enviar el peso de forma manual, mediante el botón del indicador (generalmente PRINT).</w:t>
+      </w:r>
+    </w:p>
+    <w:p>
+      <w:pPr>
+        <w:pStyle w:val="Prrafodelista"/>
+        <w:numPr>
+          <w:ilvl w:val="0"/>
+          <w:numId w:val="17"/>
+        </w:numPr>
+      </w:pPr>
+      <w:r>
+        <w:t>Tecla F12.- Cuando queremos capturar el peso desde el teclado del PC, mediante la tecla F12.</w:t>
+      </w:r>
+    </w:p>
+    <w:p>
+      <w:pPr>
+        <w:pStyle w:val="Prrafodelista"/>
+        <w:numPr>
+          <w:ilvl w:val="0"/>
+          <w:numId w:val="17"/>
+        </w:numPr>
+      </w:pPr>
+      <w:r>
+        <w:t>Automático al estabilizarse.- Cuando queremos que el peso se escriba de forma automática cada vez que la balanza se estabiliza (el usuario puede configurar el tiempo para estabilización de acuerdo con el tipo de producto que esté pesando).</w:t>
+      </w:r>
+    </w:p>
+    <w:p/>
+    <w:p>
+      <w:r>
+        <w:t>Para el caso de obtener el peso mediante la tecla F12 y de manera automática, siempre el indicador deberá pasar por cero antes de tomar una nueva lectura.</w:t>
+      </w:r>
+    </w:p>
+    <w:p/>
+    <w:p>
+      <w:r>
+        <w:t>Adicionalmente, el usuario puede restringir los pesos que se escriban en su aplicación, configurando un rango válido para ello, por ejemplo, puede establecer que no se registren pesos que estén fuera del rango de 100 a 500 gramos. En el caso de este ejemplo, todos los pesos que estén dentro del rango configurado, se escribirán en el campo activo de la aplicación del usuario, pero si estuvieran fuera del rango, se mostrará una advertencia indicando que el peso no se registró</w:t>
+      </w:r>
+      <w:r>
+        <w:t>.</w:t>
+      </w:r>
+    </w:p>
+    <w:p/>
+    <w:p>
+      <w:r>
+        <w:drawing>
+          <wp:inline distT="0" distB="0" distL="0" distR="0" wp14:anchorId="60DC3601" wp14:editId="3A2FF727">
+            <wp:extent cx="5612130" cy="2208530"/>
+            <wp:effectExtent l="0" t="0" r="7620" b="1270"/>
+            <wp:docPr id="1929385076" name="Imagen 1"/>
+            <wp:cNvGraphicFramePr>
+              <a:graphicFrameLocks xmlns:a="http://schemas.openxmlformats.org/drawingml/2006/main" noChangeAspect="1"/>
+            </wp:cNvGraphicFramePr>
+            <a:graphic xmlns:a="http://schemas.openxmlformats.org/drawingml/2006/main">
+              <a:graphicData uri="http://schemas.openxmlformats.org/drawingml/2006/picture">
+                <pic:pic xmlns:pic="http://schemas.openxmlformats.org/drawingml/2006/picture">
+                  <pic:nvPicPr>
+                    <pic:cNvPr id="1929385076" name=""/>
+                    <pic:cNvPicPr/>
+                  </pic:nvPicPr>
+                  <pic:blipFill>
+                    <a:blip r:embed="rId15"/>
+                    <a:stretch>
+                      <a:fillRect/>
+                    </a:stretch>
+                  </pic:blipFill>
+                  <pic:spPr>
+                    <a:xfrm>
+                      <a:off x="0" y="0"/>
+                      <a:ext cx="5612130" cy="2208530"/>
+                    </a:xfrm>
+                    <a:prstGeom prst="rect">
+                      <a:avLst/>
+                    </a:prstGeom>
+                  </pic:spPr>
+                </pic:pic>
+              </a:graphicData>
+            </a:graphic>
+          </wp:inline>
+        </w:drawing>
+      </w:r>
+      <w:r>
+        <w:t xml:space="preserve"> </w:t>
+      </w:r>
+    </w:p>
+    <w:p>
+      <w:pPr>
+        <w:jc w:val="both"/>
+      </w:pPr>
+    </w:p>
+    <w:p>
+      <w:pPr>
+        <w:pStyle w:val="Ttulo2"/>
+        <w:jc w:val="both"/>
+        <w:numPr>
+          <w:ilvl w:val="0"/>
+          <w:numId w:val="1"/>
+        </w:numPr>
+      </w:pPr>
+      <w:r>
+        <w:lastRenderedPageBreak/>
         <w:t>Resolución rápida de problemas</w:t>
       </w:r>
     </w:p>
@@ -1592,7 +1842,7 @@
         <w:jc w:val="both"/>
       </w:pPr>
       <w:r>
-        <w:t>Si la aplicación quedó bloqueada, revise el estado de licencia y solicite activación  si ya terminó el periodo de prueba.</w:t>
+        <w:t>Si la aplicación quedó bloqueada, revise el estado de licencia y solicite activación si ya terminó el periodo de prueba.</w:t>
       </w:r>
     </w:p>
     <w:p>
@@ -1605,7 +1855,6 @@
         <w:jc w:val="both"/>
       </w:pPr>
       <w:r>
-        <w:lastRenderedPageBreak/>
         <w:t>TCP: comprobar IP, puerto y conectividad.</w:t>
       </w:r>
     </w:p>
@@ -1651,15 +1900,10 @@
       </w:r>
     </w:p>
     <w:p>
-      <w:pPr>
-        <w:jc w:val="both"/>
-      </w:pPr>
-    </w:p>
-    <w:p>
       <w:r>
         <w:t xml:space="preserve">Cualquier soporte adicional, por favor dirigirse al siguiente </w:t>
       </w:r>
-      <w:hyperlink r:id="rId14" w:history="1">
+      <w:hyperlink r:id="rId16" w:history="1">
         <w:r>
           <w:rPr>
             <w:rStyle w:val="Hipervnculo"/>
@@ -1667,20 +1911,7 @@
           <w:t>enlace.</w:t>
         </w:r>
       </w:hyperlink>
-      <w:r>
-        <w:br/>
-      </w:r>
-    </w:p>
-    <w:p>
-      <w:pPr>
-        <w:jc w:val="both"/>
-      </w:pPr>
-      <w:r>
-        <w:t>Agradecemos su confianza y preferencia por</w:t>
-      </w:r>
-      <w:r>
-        <w:t xml:space="preserve"> PONDERA.</w:t>
-      </w:r>
+      <w:r/>
     </w:p>
     <w:sectPr>
       <w:pgSz w:w="12240" w:h="15840"/>
@@ -1693,7 +1924,7 @@
 </file>
 
 <file path=word/numbering.xml><?xml version="1.0" encoding="utf-8"?>
-<w:numbering xmlns:wpc="http://schemas.microsoft.com/office/word/2010/wordprocessingCanvas" xmlns:cx="http://schemas.microsoft.com/office/drawing/2014/chartex" xmlns:cx1="http://schemas.microsoft.com/office/drawing/2015/9/8/chartex" xmlns:cx2="http://schemas.microsoft.com/office/drawing/2015/10/21/chartex" xmlns:cx3="http://schemas.microsoft.com/office/drawing/2016/5/9/chartex" xmlns:cx4="http://schemas.microsoft.com/office/drawing/2016/5/10/chartex" xmlns:cx5="http://schemas.microsoft.com/office/drawing/2016/5/11/chartex" xmlns:cx6="http://schemas.microsoft.com/office/drawing/2016/5/12/chartex" xmlns:cx7="http://schemas.microsoft.com/office/drawing/2016/5/13/chartex" xmlns:cx8="http://schemas.microsoft.com/office/drawing/2016/5/14/chartex" xmlns:mc="http://schemas.openxmlformats.org/markup-compatibility/2006" xmlns:m="http://schemas.openxmlformats.org/officeDocument/2006/math" xmlns:aink="http://schemas.microsoft.com/office/drawing/2016/ink" xmlns:am3d="http://schemas.microsoft.com/office/drawing/2017/model3d" xmlns:oel="http://schemas.microsoft.com/office/2019/extlst" xmlns:r="http://schemas.openxmlformats.org/officeDocument/2006/relationships" xmlns:wp14="http://schemas.microsoft.com/office/word/2010/wordprocessingDrawing" xmlns:wp="http://schemas.openxmlformats.org/drawingml/2006/wordprocessingDrawing" xmlns:wpg="http://schemas.microsoft.com/office/word/2010/wordprocessingGroup" xmlns:wpi="http://schemas.microsoft.com/office/word/2010/wordprocessingInk" xmlns:wps="http://schemas.microsoft.com/office/word/2010/wordprocessingShape" xmlns:o="urn:schemas-microsoft-com:office:office" xmlns:v="urn:schemas-microsoft-com:vml" xmlns:w10="urn:schemas-microsoft-com:office:word" xmlns:w="http://schemas.openxmlformats.org/wordprocessingml/2006/main" xmlns:w14="http://schemas.microsoft.com/office/word/2010/wordml" xmlns:w15="http://schemas.microsoft.com/office/word/2012/wordml" xmlns:w16cex="http://schemas.microsoft.com/office/word/2018/wordml/cex" xmlns:w16cid="http://schemas.microsoft.com/office/word/2016/wordml/cid" xmlns:w16="http://schemas.microsoft.com/office/word/2018/wordml" xmlns:w16sdtdh="http://schemas.microsoft.com/office/word/2020/wordml/sdtdatahash" xmlns:w16sdtfl="http://schemas.microsoft.com/office/word/2024/wordml/sdtformatlock" xmlns:w16se="http://schemas.microsoft.com/office/word/2015/wordml/symex" xmlns:w16du="http://schemas.microsoft.com/office/word/2023/wordml/word16du" xmlns:wne="http://schemas.microsoft.com/office/word/2006/wordml" mc:Ignorable="w14 w15 w16se w16cid w16 w16cex w16sdtdh w16sdtfl w16du wp14">
+<w:numbering xmlns:wpc="http://schemas.microsoft.com/office/word/2010/wordprocessingCanvas" xmlns:cx="http://schemas.microsoft.com/office/drawing/2014/chartex" xmlns:cx1="http://schemas.microsoft.com/office/drawing/2015/9/8/chartex" xmlns:cx2="http://schemas.microsoft.com/office/drawing/2015/10/21/chartex" xmlns:cx3="http://schemas.microsoft.com/office/drawing/2016/5/9/chartex" xmlns:cx4="http://schemas.microsoft.com/office/drawing/2016/5/10/chartex" xmlns:cx5="http://schemas.microsoft.com/office/drawing/2016/5/11/chartex" xmlns:cx6="http://schemas.microsoft.com/office/drawing/2016/5/12/chartex" xmlns:cx7="http://schemas.microsoft.com/office/drawing/2016/5/13/chartex" xmlns:cx8="http://schemas.microsoft.com/office/drawing/2016/5/14/chartex" xmlns:mc="http://schemas.openxmlformats.org/markup-compatibility/2006" xmlns:aink="http://schemas.microsoft.com/office/drawing/2016/ink" xmlns:am3d="http://schemas.microsoft.com/office/drawing/2017/model3d" xmlns:o="urn:schemas-microsoft-com:office:office" xmlns:oel="http://schemas.microsoft.com/office/2019/extlst" xmlns:r="http://schemas.openxmlformats.org/officeDocument/2006/relationships" xmlns:m="http://schemas.openxmlformats.org/officeDocument/2006/math" xmlns:v="urn:schemas-microsoft-com:vml" xmlns:wp14="http://schemas.microsoft.com/office/word/2010/wordprocessingDrawing" xmlns:wp="http://schemas.openxmlformats.org/drawingml/2006/wordprocessingDrawing" xmlns:w10="urn:schemas-microsoft-com:office:word" xmlns:w="http://schemas.openxmlformats.org/wordprocessingml/2006/main" xmlns:w14="http://schemas.microsoft.com/office/word/2010/wordml" xmlns:w15="http://schemas.microsoft.com/office/word/2012/wordml" xmlns:w16cex="http://schemas.microsoft.com/office/word/2018/wordml/cex" xmlns:w16cid="http://schemas.microsoft.com/office/word/2016/wordml/cid" xmlns:w16="http://schemas.microsoft.com/office/word/2018/wordml" xmlns:w16du="http://schemas.microsoft.com/office/word/2023/wordml/word16du" xmlns:w16sdtdh="http://schemas.microsoft.com/office/word/2020/wordml/sdtdatahash" xmlns:w16sdtfl="http://schemas.microsoft.com/office/word/2024/wordml/sdtformatlock" xmlns:w16se="http://schemas.microsoft.com/office/word/2015/wordml/symex" xmlns:wpg="http://schemas.microsoft.com/office/word/2010/wordprocessingGroup" xmlns:wpi="http://schemas.microsoft.com/office/word/2010/wordprocessingInk" xmlns:wne="http://schemas.microsoft.com/office/word/2006/wordml" xmlns:wps="http://schemas.microsoft.com/office/word/2010/wordprocessingShape" mc:Ignorable="w14 w15 w16se w16cid w16 w16cex w16sdtdh w16sdtfl w16du wp14">
   <w:abstractNum w:abstractNumId="0" w15:restartNumberingAfterBreak="0">
     <w:nsid w:val="028C5883"/>
     <w:multiLevelType w:val="hybridMultilevel"/>
@@ -2266,6 +2497,7 @@
     <w:lvl w:ilvl="0" w:tplc="080A000F">
       <w:start w:val="1"/>
       <w:numFmt w:val="decimal"/>
+      <w:suff w:val="space"/>
       <w:lvlText w:val="%1."/>
       <w:lvlJc w:val="left"/>
       <w:pPr>
@@ -2552,6 +2784,178 @@
     </w:lvl>
   </w:abstractNum>
   <w:abstractNum w:abstractNumId="8" w15:restartNumberingAfterBreak="0">
+    <w:nsid w:val="30FC00CF"/>
+    <w:multiLevelType w:val="hybridMultilevel"/>
+    <w:tmpl w:val="5726BF16"/>
+    <w:lvl w:ilvl="0" w:tplc="300A000F">
+      <w:start w:val="1"/>
+      <w:numFmt w:val="decimal"/>
+      <w:lvlText w:val="%1."/>
+      <w:lvlJc w:val="left"/>
+      <w:pPr>
+        <w:ind w:left="720" w:hanging="360"/>
+      </w:pPr>
+    </w:lvl>
+    <w:lvl w:ilvl="1" w:tplc="300A0019" w:tentative="1">
+      <w:start w:val="1"/>
+      <w:numFmt w:val="lowerLetter"/>
+      <w:lvlText w:val="%2."/>
+      <w:lvlJc w:val="left"/>
+      <w:pPr>
+        <w:ind w:left="1440" w:hanging="360"/>
+      </w:pPr>
+    </w:lvl>
+    <w:lvl w:ilvl="2" w:tplc="300A001B" w:tentative="1">
+      <w:start w:val="1"/>
+      <w:numFmt w:val="lowerRoman"/>
+      <w:lvlText w:val="%3."/>
+      <w:lvlJc w:val="right"/>
+      <w:pPr>
+        <w:ind w:left="2160" w:hanging="180"/>
+      </w:pPr>
+    </w:lvl>
+    <w:lvl w:ilvl="3" w:tplc="300A000F" w:tentative="1">
+      <w:start w:val="1"/>
+      <w:numFmt w:val="decimal"/>
+      <w:lvlText w:val="%4."/>
+      <w:lvlJc w:val="left"/>
+      <w:pPr>
+        <w:ind w:left="2880" w:hanging="360"/>
+      </w:pPr>
+    </w:lvl>
+    <w:lvl w:ilvl="4" w:tplc="300A0019" w:tentative="1">
+      <w:start w:val="1"/>
+      <w:numFmt w:val="lowerLetter"/>
+      <w:lvlText w:val="%5."/>
+      <w:lvlJc w:val="left"/>
+      <w:pPr>
+        <w:ind w:left="3600" w:hanging="360"/>
+      </w:pPr>
+    </w:lvl>
+    <w:lvl w:ilvl="5" w:tplc="300A001B" w:tentative="1">
+      <w:start w:val="1"/>
+      <w:numFmt w:val="lowerRoman"/>
+      <w:lvlText w:val="%6."/>
+      <w:lvlJc w:val="right"/>
+      <w:pPr>
+        <w:ind w:left="4320" w:hanging="180"/>
+      </w:pPr>
+    </w:lvl>
+    <w:lvl w:ilvl="6" w:tplc="300A000F" w:tentative="1">
+      <w:start w:val="1"/>
+      <w:numFmt w:val="decimal"/>
+      <w:lvlText w:val="%7."/>
+      <w:lvlJc w:val="left"/>
+      <w:pPr>
+        <w:ind w:left="5040" w:hanging="360"/>
+      </w:pPr>
+    </w:lvl>
+    <w:lvl w:ilvl="7" w:tplc="300A0019" w:tentative="1">
+      <w:start w:val="1"/>
+      <w:numFmt w:val="lowerLetter"/>
+      <w:lvlText w:val="%8."/>
+      <w:lvlJc w:val="left"/>
+      <w:pPr>
+        <w:ind w:left="5760" w:hanging="360"/>
+      </w:pPr>
+    </w:lvl>
+    <w:lvl w:ilvl="8" w:tplc="300A001B" w:tentative="1">
+      <w:start w:val="1"/>
+      <w:numFmt w:val="lowerRoman"/>
+      <w:lvlText w:val="%9."/>
+      <w:lvlJc w:val="right"/>
+      <w:pPr>
+        <w:ind w:left="6480" w:hanging="180"/>
+      </w:pPr>
+    </w:lvl>
+  </w:abstractNum>
+  <w:abstractNum w:abstractNumId="9" w15:restartNumberingAfterBreak="0">
+    <w:nsid w:val="43AE3623"/>
+    <w:multiLevelType w:val="hybridMultilevel"/>
+    <w:tmpl w:val="358CBF64"/>
+    <w:lvl w:ilvl="0" w:tplc="300A000F">
+      <w:start w:val="1"/>
+      <w:numFmt w:val="decimal"/>
+      <w:lvlText w:val="%1."/>
+      <w:lvlJc w:val="left"/>
+      <w:pPr>
+        <w:ind w:left="720" w:hanging="360"/>
+      </w:pPr>
+    </w:lvl>
+    <w:lvl w:ilvl="1" w:tplc="300A0019" w:tentative="1">
+      <w:start w:val="1"/>
+      <w:numFmt w:val="lowerLetter"/>
+      <w:lvlText w:val="%2."/>
+      <w:lvlJc w:val="left"/>
+      <w:pPr>
+        <w:ind w:left="1440" w:hanging="360"/>
+      </w:pPr>
+    </w:lvl>
+    <w:lvl w:ilvl="2" w:tplc="300A001B" w:tentative="1">
+      <w:start w:val="1"/>
+      <w:numFmt w:val="lowerRoman"/>
+      <w:lvlText w:val="%3."/>
+      <w:lvlJc w:val="right"/>
+      <w:pPr>
+        <w:ind w:left="2160" w:hanging="180"/>
+      </w:pPr>
+    </w:lvl>
+    <w:lvl w:ilvl="3" w:tplc="300A000F" w:tentative="1">
+      <w:start w:val="1"/>
+      <w:numFmt w:val="decimal"/>
+      <w:lvlText w:val="%4."/>
+      <w:lvlJc w:val="left"/>
+      <w:pPr>
+        <w:ind w:left="2880" w:hanging="360"/>
+      </w:pPr>
+    </w:lvl>
+    <w:lvl w:ilvl="4" w:tplc="300A0019" w:tentative="1">
+      <w:start w:val="1"/>
+      <w:numFmt w:val="lowerLetter"/>
+      <w:lvlText w:val="%5."/>
+      <w:lvlJc w:val="left"/>
+      <w:pPr>
+        <w:ind w:left="3600" w:hanging="360"/>
+      </w:pPr>
+    </w:lvl>
+    <w:lvl w:ilvl="5" w:tplc="300A001B" w:tentative="1">
+      <w:start w:val="1"/>
+      <w:numFmt w:val="lowerRoman"/>
+      <w:lvlText w:val="%6."/>
+      <w:lvlJc w:val="right"/>
+      <w:pPr>
+        <w:ind w:left="4320" w:hanging="180"/>
+      </w:pPr>
+    </w:lvl>
+    <w:lvl w:ilvl="6" w:tplc="300A000F" w:tentative="1">
+      <w:start w:val="1"/>
+      <w:numFmt w:val="decimal"/>
+      <w:lvlText w:val="%7."/>
+      <w:lvlJc w:val="left"/>
+      <w:pPr>
+        <w:ind w:left="5040" w:hanging="360"/>
+      </w:pPr>
+    </w:lvl>
+    <w:lvl w:ilvl="7" w:tplc="300A0019" w:tentative="1">
+      <w:start w:val="1"/>
+      <w:numFmt w:val="lowerLetter"/>
+      <w:lvlText w:val="%8."/>
+      <w:lvlJc w:val="left"/>
+      <w:pPr>
+        <w:ind w:left="5760" w:hanging="360"/>
+      </w:pPr>
+    </w:lvl>
+    <w:lvl w:ilvl="8" w:tplc="300A001B" w:tentative="1">
+      <w:start w:val="1"/>
+      <w:numFmt w:val="lowerRoman"/>
+      <w:lvlText w:val="%9."/>
+      <w:lvlJc w:val="right"/>
+      <w:pPr>
+        <w:ind w:left="6480" w:hanging="180"/>
+      </w:pPr>
+    </w:lvl>
+  </w:abstractNum>
+  <w:abstractNum w:abstractNumId="10" w15:restartNumberingAfterBreak="0">
     <w:nsid w:val="44DA16B2"/>
     <w:multiLevelType w:val="hybridMultilevel"/>
     <w:tmpl w:val="DD883448"/>
@@ -2664,7 +3068,7 @@
       </w:rPr>
     </w:lvl>
   </w:abstractNum>
-  <w:abstractNum w:abstractNumId="9" w15:restartNumberingAfterBreak="0">
+  <w:abstractNum w:abstractNumId="11" w15:restartNumberingAfterBreak="0">
     <w:nsid w:val="58B604C6"/>
     <w:multiLevelType w:val="hybridMultilevel"/>
     <w:tmpl w:val="ABDA390C"/>
@@ -2777,7 +3181,7 @@
       </w:rPr>
     </w:lvl>
   </w:abstractNum>
-  <w:abstractNum w:abstractNumId="10" w15:restartNumberingAfterBreak="0">
+  <w:abstractNum w:abstractNumId="12" w15:restartNumberingAfterBreak="0">
     <w:nsid w:val="59B539DB"/>
     <w:multiLevelType w:val="hybridMultilevel"/>
     <w:tmpl w:val="A000B116"/>
@@ -2890,7 +3294,7 @@
       </w:rPr>
     </w:lvl>
   </w:abstractNum>
-  <w:abstractNum w:abstractNumId="11" w15:restartNumberingAfterBreak="0">
+  <w:abstractNum w:abstractNumId="13" w15:restartNumberingAfterBreak="0">
     <w:nsid w:val="5B743B3B"/>
     <w:multiLevelType w:val="hybridMultilevel"/>
     <w:tmpl w:val="20AA5EC8"/>
@@ -3003,7 +3407,7 @@
       </w:rPr>
     </w:lvl>
   </w:abstractNum>
-  <w:abstractNum w:abstractNumId="12" w15:restartNumberingAfterBreak="0">
+  <w:abstractNum w:abstractNumId="14" w15:restartNumberingAfterBreak="0">
     <w:nsid w:val="5BD836A6"/>
     <w:multiLevelType w:val="hybridMultilevel"/>
     <w:tmpl w:val="9ADC88D4"/>
@@ -3116,7 +3520,7 @@
       </w:rPr>
     </w:lvl>
   </w:abstractNum>
-  <w:abstractNum w:abstractNumId="13" w15:restartNumberingAfterBreak="0">
+  <w:abstractNum w:abstractNumId="15" w15:restartNumberingAfterBreak="0">
     <w:nsid w:val="75E23819"/>
     <w:multiLevelType w:val="multilevel"/>
     <w:tmpl w:val="E06C3D8E"/>
@@ -3230,7 +3634,7 @@
       </w:rPr>
     </w:lvl>
   </w:abstractNum>
-  <w:abstractNum w:abstractNumId="14" w15:restartNumberingAfterBreak="0">
+  <w:abstractNum w:abstractNumId="16" w15:restartNumberingAfterBreak="0">
     <w:nsid w:val="77BE7B24"/>
     <w:multiLevelType w:val="hybridMultilevel"/>
     <w:tmpl w:val="C17E726C"/>
@@ -3350,37 +3754,37 @@
     <w:abstractNumId w:val="0"/>
   </w:num>
   <w:num w:numId="3" w16cid:durableId="681664667">
-    <w:abstractNumId w:val="10"/>
+    <w:abstractNumId w:val="12"/>
   </w:num>
   <w:num w:numId="4" w16cid:durableId="942153789">
     <w:abstractNumId w:val="1"/>
   </w:num>
   <w:num w:numId="5" w16cid:durableId="648897648">
-    <w:abstractNumId w:val="11"/>
+    <w:abstractNumId w:val="13"/>
   </w:num>
   <w:num w:numId="6" w16cid:durableId="1214847874">
     <w:abstractNumId w:val="3"/>
   </w:num>
   <w:num w:numId="7" w16cid:durableId="297103552">
-    <w:abstractNumId w:val="8"/>
+    <w:abstractNumId w:val="10"/>
   </w:num>
   <w:num w:numId="8" w16cid:durableId="1487933841">
     <w:abstractNumId w:val="4"/>
   </w:num>
   <w:num w:numId="9" w16cid:durableId="1180973208">
-    <w:abstractNumId w:val="12"/>
+    <w:abstractNumId w:val="14"/>
   </w:num>
   <w:num w:numId="10" w16cid:durableId="1890915318">
-    <w:abstractNumId w:val="13"/>
+    <w:abstractNumId w:val="15"/>
   </w:num>
   <w:num w:numId="11" w16cid:durableId="547306375">
-    <w:abstractNumId w:val="9"/>
+    <w:abstractNumId w:val="11"/>
   </w:num>
   <w:num w:numId="12" w16cid:durableId="1569657283">
     <w:abstractNumId w:val="7"/>
   </w:num>
   <w:num w:numId="13" w16cid:durableId="1822429581">
-    <w:abstractNumId w:val="14"/>
+    <w:abstractNumId w:val="16"/>
   </w:num>
   <w:num w:numId="14" w16cid:durableId="1753964487">
     <w:abstractNumId w:val="2"/>
@@ -3388,11 +3792,17 @@
   <w:num w:numId="15" w16cid:durableId="1101755630">
     <w:abstractNumId w:val="6"/>
   </w:num>
+  <w:num w:numId="16" w16cid:durableId="874731517">
+    <w:abstractNumId w:val="9"/>
+  </w:num>
+  <w:num w:numId="17" w16cid:durableId="1622809278">
+    <w:abstractNumId w:val="8"/>
+  </w:num>
 </w:numbering>
 </file>
 
 <file path=word/styles.xml><?xml version="1.0" encoding="utf-8"?>
-<w:styles xmlns:mc="http://schemas.openxmlformats.org/markup-compatibility/2006" xmlns:r="http://schemas.openxmlformats.org/officeDocument/2006/relationships" xmlns:w="http://schemas.openxmlformats.org/wordprocessingml/2006/main" xmlns:w14="http://schemas.microsoft.com/office/word/2010/wordml" xmlns:w15="http://schemas.microsoft.com/office/word/2012/wordml" xmlns:w16cex="http://schemas.microsoft.com/office/word/2018/wordml/cex" xmlns:w16cid="http://schemas.microsoft.com/office/word/2016/wordml/cid" xmlns:w16="http://schemas.microsoft.com/office/word/2018/wordml" xmlns:w16sdtdh="http://schemas.microsoft.com/office/word/2020/wordml/sdtdatahash" xmlns:w16sdtfl="http://schemas.microsoft.com/office/word/2024/wordml/sdtformatlock" xmlns:w16se="http://schemas.microsoft.com/office/word/2015/wordml/symex" xmlns:w16du="http://schemas.microsoft.com/office/word/2023/wordml/word16du" mc:Ignorable="w14 w15 w16se w16cid w16 w16cex w16sdtdh w16sdtfl w16du">
+<w:styles xmlns:mc="http://schemas.openxmlformats.org/markup-compatibility/2006" xmlns:r="http://schemas.openxmlformats.org/officeDocument/2006/relationships" xmlns:w="http://schemas.openxmlformats.org/wordprocessingml/2006/main" xmlns:w14="http://schemas.microsoft.com/office/word/2010/wordml" xmlns:w15="http://schemas.microsoft.com/office/word/2012/wordml" xmlns:w16cex="http://schemas.microsoft.com/office/word/2018/wordml/cex" xmlns:w16cid="http://schemas.microsoft.com/office/word/2016/wordml/cid" xmlns:w16="http://schemas.microsoft.com/office/word/2018/wordml" xmlns:w16du="http://schemas.microsoft.com/office/word/2023/wordml/word16du" xmlns:w16sdtdh="http://schemas.microsoft.com/office/word/2020/wordml/sdtdatahash" xmlns:w16sdtfl="http://schemas.microsoft.com/office/word/2024/wordml/sdtformatlock" xmlns:w16se="http://schemas.microsoft.com/office/word/2015/wordml/symex" mc:Ignorable="w14 w15 w16se w16cid w16 w16cex w16sdtdh w16sdtfl w16du">
   <w:docDefaults>
     <w:rPrDefault>
       <w:rPr>

</xml_diff>